<commit_message>
Parallelogram worksheet: two missions, two per page
The dashed cut line is gone from the shape — deciding where to cut is
part of the thinking now. The sheet is down to two missions: turn the
parallelogram into a rectangle, then write the formula for its area.
Every other blank is gone and the wording is a single line each.

Two copies fit on one A4 page with a cut-here rule between them, so one
sheet of paper serves two students.

Co-Authored-By: Claude Opus 5 <noreply@anthropic.com>
</commit_message>
<xml_diff>
--- a/worksheets/Turning-a-Parallelogram-into-a-Rectangle.docx
+++ b/worksheets/Turning-a-Parallelogram-into-a-Rectangle.docx
@@ -4,63 +4,67 @@
   <w:body>
     <w:p>
       <w:pPr>
-        <w:pStyle w:val="Heading1"/>
-        <w:spacing w:after="60"/>
-      </w:pPr>
-      <w:r>
-        <w:rPr>
-          <w:b/>
-          <w:bCs/>
-          <w:sz w:val="32"/>
-          <w:szCs w:val="32"/>
+        <w:spacing w:after="30"/>
+      </w:pPr>
+      <w:r>
+        <w:rPr>
+          <w:b/>
+          <w:bCs/>
+          <w:sz w:val="26"/>
+          <w:szCs w:val="26"/>
         </w:rPr>
         <w:t xml:space="preserve">Turning a Parallelogram into a Rectangle</w:t>
       </w:r>
+      <w:r>
+        <w:rPr>
+          <w:sz w:val="18"/>
+          <w:szCs w:val="18"/>
+        </w:rPr>
+        <w:t xml:space="preserve">          Name: ____________________</w:t>
+      </w:r>
     </w:p>
     <w:p>
       <w:pPr>
         <w:pBdr>
-          <w:bottom w:val="single" w:color="000000" w:sz="6" w:space="6"/>
+          <w:bottom w:val="single" w:color="808080" w:sz="6" w:space="8"/>
         </w:pBdr>
-        <w:spacing w:after="40"/>
-      </w:pPr>
-      <w:r>
-        <w:rPr>
-          <w:sz w:val="20"/>
-          <w:szCs w:val="20"/>
-        </w:rPr>
-        <w:t xml:space="preserve">Name: ______________________     Date: ____________</w:t>
-      </w:r>
-    </w:p>
-    <w:p>
-      <w:pPr>
-        <w:spacing w:after="40" w:before="140"/>
-      </w:pPr>
-      <w:r>
-        <w:rPr>
-          <w:sz w:val="20"/>
-          <w:szCs w:val="20"/>
-        </w:rPr>
-        <w:t xml:space="preserve">Cut out the parallelogram. Cut along the dashed line, then slide the triangle across to the other side to make a rectangle. Glue it into your book and write down its area.</w:t>
-      </w:r>
-    </w:p>
-    <w:p>
-      <w:pPr>
-        <w:spacing w:after="140"/>
+        <w:spacing w:after="110"/>
       </w:pPr>
       <w:r>
         <w:rPr>
           <w:i/>
           <w:iCs/>
-          <w:sz w:val="20"/>
-          <w:szCs w:val="20"/>
-        </w:rPr>
-        <w:t xml:space="preserve">Every square stands for 1 cm.</w:t>
-      </w:r>
-    </w:p>
-    <w:p>
-      <w:pPr>
-        <w:spacing w:after="220" w:before="60"/>
+          <w:sz w:val="17"/>
+          <w:szCs w:val="17"/>
+        </w:rPr>
+        <w:t xml:space="preserve">Each square is 1 cm.</w:t>
+      </w:r>
+    </w:p>
+    <w:p>
+      <w:pPr>
+        <w:spacing w:after="60" w:before="90"/>
+      </w:pPr>
+      <w:r>
+        <w:rPr>
+          <w:b/>
+          <w:bCs/>
+          <w:color w:val="1F5A54"/>
+          <w:sz w:val="21"/>
+          <w:szCs w:val="21"/>
+        </w:rPr>
+        <w:t xml:space="preserve">Mission 1   </w:t>
+      </w:r>
+      <w:r>
+        <w:rPr>
+          <w:sz w:val="21"/>
+          <w:szCs w:val="21"/>
+        </w:rPr>
+        <w:t xml:space="preserve">Cut out the parallelogram. Turn it into a rectangle.</w:t>
+      </w:r>
+    </w:p>
+    <w:p>
+      <w:pPr>
+        <w:spacing w:after="90" w:before="30"/>
         <w:jc w:val="left"/>
       </w:pPr>
       <w:r>
@@ -106,44 +110,208 @@
     </w:p>
     <w:p>
       <w:pPr>
-        <w:spacing w:after="40" w:before="120"/>
-      </w:pPr>
-      <w:r>
-        <w:rPr>
-          <w:b/>
-          <w:bCs/>
-          <w:sz w:val="22"/>
-          <w:szCs w:val="22"/>
-        </w:rPr>
-        <w:t xml:space="preserve">base = ________ cm          height = ________ cm</w:t>
-      </w:r>
-    </w:p>
-    <w:p>
-      <w:pPr>
-        <w:spacing w:after="160" w:before="60"/>
-      </w:pPr>
-      <w:r>
-        <w:rPr>
-          <w:b/>
-          <w:bCs/>
-          <w:sz w:val="22"/>
-          <w:szCs w:val="22"/>
-        </w:rPr>
-        <w:t xml:space="preserve">Area of the rectangle = ________ cm²          Area of the parallelogram = ________ cm²</w:t>
+        <w:spacing w:after="70"/>
+      </w:pPr>
+      <w:r>
+        <w:rPr>
+          <w:b/>
+          <w:bCs/>
+          <w:color w:val="1F5A54"/>
+          <w:sz w:val="21"/>
+          <w:szCs w:val="21"/>
+        </w:rPr>
+        <w:t xml:space="preserve">Mission 2   </w:t>
+      </w:r>
+      <w:r>
+        <w:rPr>
+          <w:sz w:val="21"/>
+          <w:szCs w:val="21"/>
+        </w:rPr>
+        <w:t xml:space="preserve">What is the formula for the area of a parallelogram?</w:t>
       </w:r>
     </w:p>
     <w:p>
       <w:pPr>
         <w:spacing w:after="40"/>
+      </w:pPr>
+      <w:r>
+        <w:rPr>
+          <w:b/>
+          <w:bCs/>
+          <w:sz w:val="21"/>
+          <w:szCs w:val="21"/>
+        </w:rPr>
+        <w:t xml:space="preserve">Area = </w:t>
+      </w:r>
+      <w:r>
+        <w:rPr>
+          <w:sz w:val="21"/>
+          <w:szCs w:val="21"/>
+        </w:rPr>
+        <w:t xml:space="preserve">_______________________________________</w:t>
+      </w:r>
+    </w:p>
+    <w:p>
+      <w:pPr>
+        <w:spacing w:after="140" w:before="140"/>
+        <w:jc w:val="center"/>
+      </w:pPr>
+      <w:r>
+        <w:rPr>
+          <w:color w:val="808080"/>
+          <w:sz w:val="16"/>
+          <w:szCs w:val="16"/>
+        </w:rPr>
+        <w:t xml:space="preserve">✂  - - - - - - - - - - - - - - - - - - - - - - - - - - - - - - - - - - - - - - - - - - - - - - - - - -</w:t>
+      </w:r>
+    </w:p>
+    <w:p>
+      <w:pPr>
+        <w:spacing w:after="30"/>
+      </w:pPr>
+      <w:r>
+        <w:rPr>
+          <w:b/>
+          <w:bCs/>
+          <w:sz w:val="26"/>
+          <w:szCs w:val="26"/>
+        </w:rPr>
+        <w:t xml:space="preserve">Turning a Parallelogram into a Rectangle</w:t>
+      </w:r>
+      <w:r>
+        <w:rPr>
+          <w:sz w:val="18"/>
+          <w:szCs w:val="18"/>
+        </w:rPr>
+        <w:t xml:space="preserve">          Name: ____________________</w:t>
+      </w:r>
+    </w:p>
+    <w:p>
+      <w:pPr>
+        <w:pBdr>
+          <w:bottom w:val="single" w:color="808080" w:sz="6" w:space="8"/>
+        </w:pBdr>
+        <w:spacing w:after="110"/>
       </w:pPr>
       <w:r>
         <w:rPr>
           <w:i/>
           <w:iCs/>
-          <w:sz w:val="20"/>
-          <w:szCs w:val="20"/>
-        </w:rPr>
-        <w:t xml:space="preserve">What do you notice? Write one sentence about the base, the height and the area.</w:t>
+          <w:sz w:val="17"/>
+          <w:szCs w:val="17"/>
+        </w:rPr>
+        <w:t xml:space="preserve">Each square is 1 cm.</w:t>
+      </w:r>
+    </w:p>
+    <w:p>
+      <w:pPr>
+        <w:spacing w:after="60" w:before="90"/>
+      </w:pPr>
+      <w:r>
+        <w:rPr>
+          <w:b/>
+          <w:bCs/>
+          <w:color w:val="1F5A54"/>
+          <w:sz w:val="21"/>
+          <w:szCs w:val="21"/>
+        </w:rPr>
+        <w:t xml:space="preserve">Mission 1   </w:t>
+      </w:r>
+      <w:r>
+        <w:rPr>
+          <w:sz w:val="21"/>
+          <w:szCs w:val="21"/>
+        </w:rPr>
+        <w:t xml:space="preserve">Cut out the parallelogram. Turn it into a rectangle.</w:t>
+      </w:r>
+    </w:p>
+    <w:p>
+      <w:pPr>
+        <w:spacing w:after="90" w:before="30"/>
+        <w:jc w:val="left"/>
+      </w:pPr>
+      <w:r>
+        <w:drawing>
+          <wp:inline distT="0" distB="0" distL="0" distR="0">
+            <wp:extent cx="2520000" cy="1800000"/>
+            <wp:effectExtent t="0" r="0" b="0" l="0"/>
+            <wp:docPr id="2" name="" descr="parallelogram on a centimetre grid" title=""/>
+            <wp:cNvGraphicFramePr>
+              <a:graphicFrameLocks xmlns:a="http://schemas.openxmlformats.org/drawingml/2006/main" noChangeAspect="1"/>
+            </wp:cNvGraphicFramePr>
+            <a:graphic xmlns:a="http://schemas.openxmlformats.org/drawingml/2006/main">
+              <a:graphicData uri="http://schemas.openxmlformats.org/drawingml/2006/picture">
+                <pic:pic xmlns:pic="http://schemas.openxmlformats.org/drawingml/2006/picture">
+                  <pic:nvPicPr>
+                    <pic:cNvPr id="0" name="" descr=""/>
+                    <pic:cNvPicPr>
+                      <a:picLocks noChangeAspect="1" noChangeArrowheads="1"/>
+                    </pic:cNvPicPr>
+                  </pic:nvPicPr>
+                  <pic:blipFill>
+                    <a:blip r:embed="rIdImg1" cstate="none"/>
+                    <a:srcRect/>
+                    <a:stretch>
+                      <a:fillRect/>
+                    </a:stretch>
+                  </pic:blipFill>
+                  <pic:spPr bwMode="auto">
+                    <a:xfrm>
+                      <a:off x="0" y="0"/>
+                      <a:ext cx="2520000" cy="1800000"/>
+                    </a:xfrm>
+                    <a:prstGeom prst="rect">
+                      <a:avLst/>
+                    </a:prstGeom>
+                  </pic:spPr>
+                </pic:pic>
+              </a:graphicData>
+            </a:graphic>
+          </wp:inline>
+        </w:drawing>
+      </w:r>
+    </w:p>
+    <w:p>
+      <w:pPr>
+        <w:spacing w:after="70"/>
+      </w:pPr>
+      <w:r>
+        <w:rPr>
+          <w:b/>
+          <w:bCs/>
+          <w:color w:val="1F5A54"/>
+          <w:sz w:val="21"/>
+          <w:szCs w:val="21"/>
+        </w:rPr>
+        <w:t xml:space="preserve">Mission 2   </w:t>
+      </w:r>
+      <w:r>
+        <w:rPr>
+          <w:sz w:val="21"/>
+          <w:szCs w:val="21"/>
+        </w:rPr>
+        <w:t xml:space="preserve">What is the formula for the area of a parallelogram?</w:t>
+      </w:r>
+    </w:p>
+    <w:p>
+      <w:pPr>
+        <w:spacing w:after="40"/>
+      </w:pPr>
+      <w:r>
+        <w:rPr>
+          <w:b/>
+          <w:bCs/>
+          <w:sz w:val="21"/>
+          <w:szCs w:val="21"/>
+        </w:rPr>
+        <w:t xml:space="preserve">Area = </w:t>
+      </w:r>
+      <w:r>
+        <w:rPr>
+          <w:sz w:val="21"/>
+          <w:szCs w:val="21"/>
+        </w:rPr>
+        <w:t xml:space="preserve">_______________________________________</w:t>
       </w:r>
     </w:p>
     <w:sectPr>

</xml_diff>